<commit_message>
docs: add live site URL (pragyan-rl.vercel.app) to report; link site to Vercel project
</commit_message>
<xml_diff>
--- a/report/Pragyan_RL_Report.docx
+++ b/report/Pragyan_RL_Report.docx
@@ -2013,7 +2013,7 @@
           <w:b w:val="0"/>
           <w:i w:val="0"/>
         </w:rPr>
-        <w:t xml:space="preserve">The trained agents are demonstrated in an interactive lunar simulation (demo/index.html, runs offline in any browser). It has four views: </w:t>
+        <w:t xml:space="preserve">The trained agents are demonstrated in an interactive 3D lunar simulation on the project website (https://pragyan-rl.vercel.app, built with React and three.js; it also runs offline from the repository). It has four views: </w:t>
       </w:r>
       <w:r>
         <w:rPr>
@@ -6016,7 +6016,7 @@
     </w:p>
     <w:p>
       <w:pPr>
-        <w:spacing w:after="120"/>
+        <w:spacing w:after="40"/>
         <w:jc w:val="left"/>
       </w:pPr>
       <w:r>
@@ -6025,7 +6025,35 @@
           <w:b w:val="0"/>
           <w:i w:val="0"/>
         </w:rPr>
-        <w:t>https://github.com/Omanand10/RLMini/tree/feat/pragyan-rover  (branch feat/pragyan-rover). Run: python -m pragyan.env (self-check), python train.py (all experiments), python plots.py (figures), open demo/index.html (simulation).</w:t>
+        <w:t>Source code: https://github.com/Omanand10/RLMini</w:t>
+      </w:r>
+    </w:p>
+    <w:p>
+      <w:pPr>
+        <w:spacing w:after="40"/>
+        <w:jc w:val="left"/>
+      </w:pPr>
+      <w:r>
+        <w:rPr>
+          <w:rFonts w:ascii="Times New Roman" w:hAnsi="Times New Roman" w:eastAsia="Times New Roman"/>
+          <w:b w:val="0"/>
+          <w:i w:val="0"/>
+        </w:rPr>
+        <w:t>Live project website and interactive simulator: https://pragyan-rl.vercel.app</w:t>
+      </w:r>
+    </w:p>
+    <w:p>
+      <w:pPr>
+        <w:spacing w:after="120"/>
+        <w:jc w:val="left"/>
+      </w:pPr>
+      <w:r>
+        <w:rPr>
+          <w:rFonts w:ascii="Times New Roman" w:hAnsi="Times New Roman" w:eastAsia="Times New Roman"/>
+          <w:b w:val="0"/>
+          <w:i w:val="0"/>
+        </w:rPr>
+        <w:t>Run locally: in rl/, python -m pragyan.env (self-check), python train.py (all experiments), python plots.py (figures); in site/, npm install and npm run dev (website).</w:t>
       </w:r>
     </w:p>
     <w:p>

</xml_diff>

<commit_message>
docs: describe the new 3D site in report section 3.6
</commit_message>
<xml_diff>
--- a/report/Pragyan_RL_Report.docx
+++ b/report/Pragyan_RL_Report.docx
@@ -2013,7 +2013,7 @@
           <w:b w:val="0"/>
           <w:i w:val="0"/>
         </w:rPr>
-        <w:t xml:space="preserve">The trained agents are demonstrated in an interactive 3D lunar simulation on the project website (https://pragyan-rl.vercel.app, built with React and three.js; it also runs offline from the repository). It has four views: </w:t>
+        <w:t xml:space="preserve">The trained agents are demonstrated in an interactive 3D lunar simulation on the project website (https://pragyan-rl.vercel.app, built with React and three.js; it also runs offline from the repository). The site walks through the mission, the MDP and the results, and ends in a 3D Mission Control with three modes: </w:t>
       </w:r>
       <w:r>
         <w:rPr>
@@ -2021,7 +2021,7 @@
           <w:b/>
           <w:i w:val="0"/>
         </w:rPr>
-        <w:t>Mission Replay</w:t>
+        <w:t>Replay</w:t>
       </w:r>
       <w:r>
         <w:rPr>
@@ -2029,7 +2029,7 @@
           <w:b w:val="0"/>
           <w:i w:val="0"/>
         </w:rPr>
-        <w:t xml:space="preserve"> (any agent at episode 1, mid-training or fully trained, with battery, sun, sample status and a mission log), </w:t>
+        <w:t xml:space="preserve"> (any agent at episode 1, mid-training or fully trained, with a timeline, narration of each command, battery, sun phase and science status), </w:t>
       </w:r>
       <w:r>
         <w:rPr>
@@ -2037,7 +2037,7 @@
           <w:b/>
           <w:i w:val="0"/>
         </w:rPr>
-        <w:t>Head-to-Head</w:t>
+        <w:t>Compare</w:t>
       </w:r>
       <w:r>
         <w:rPr>
@@ -2045,7 +2045,7 @@
           <w:b w:val="0"/>
           <w:i w:val="0"/>
         </w:rPr>
-        <w:t xml:space="preserve"> (two agents side by side on the same map), </w:t>
+        <w:t xml:space="preserve"> (two agents side by side on the same map) and </w:t>
       </w:r>
       <w:r>
         <w:rPr>
@@ -2053,7 +2053,7 @@
           <w:b/>
           <w:i w:val="0"/>
         </w:rPr>
-        <w:t>Live: Drop a Crater</w:t>
+        <w:t>Drop a crater</w:t>
       </w:r>
       <w:r>
         <w:rPr>
@@ -2061,23 +2061,7 @@
           <w:b w:val="0"/>
           <w:i w:val="0"/>
         </w:rPr>
-        <w:t xml:space="preserve"> (the DQN agent drives in real time inside the browser; clicking a cell drops a crater or boulder, and the agent's Q-values and NavCam window are shown as it replans) and </w:t>
-      </w:r>
-      <w:r>
-        <w:rPr>
-          <w:rFonts w:ascii="Times New Roman" w:hAnsi="Times New Roman" w:eastAsia="Times New Roman"/>
-          <w:b/>
-          <w:i w:val="0"/>
-        </w:rPr>
-        <w:t>Scoreboard</w:t>
-      </w:r>
-      <w:r>
-        <w:rPr>
-          <w:rFonts w:ascii="Times New Roman" w:hAnsi="Times New Roman" w:eastAsia="Times New Roman"/>
-          <w:b w:val="0"/>
-          <w:i w:val="0"/>
-        </w:rPr>
-        <w:t>. In 200 scripted tests in which a crater was dropped on the exact cell the DQN rover was about to enter, it changed its command every time and avoided the new crater in 90% of cases.</w:t>
+        <w:t xml:space="preserve"> (the DQN drives in real time in the browser; clicking the terrain adds a crater or boulder, and the panel shows how good the network rates each command). In 200 scripted tests in which a crater was dropped on the exact cell the DQN rover was about to enter, it changed its command every time and avoided the new crater in 90% of cases.</w:t>
       </w:r>
     </w:p>
     <w:tbl>

</xml_diff>

<commit_message>
feat(site): viewport-scaled one-screen panels, minimap, RL episode notes, team names
- Root size from min(1vw, 1.6vh): same layout on a 13-inch laptop and a
  27-inch monitor; every snap stop fits one screen (mandatory snap)
- RL problem and results split into two screens each
- Mission control fits one screen: 3D view, 2D top-down map (clickable in
  live mode), 'about this episode' in RL terms, state and goal progress
- Value Iteration labelled as the optimal reference, Q-learning as the
  best learning agent
- Team names in hero, footer and report info table
</commit_message>
<xml_diff>
--- a/report/Pragyan_RL_Report.docx
+++ b/report/Pragyan_RL_Report.docx
@@ -60,7 +60,7 @@
         </w:tc>
         <w:tc>
           <w:tcPr>
-            <w:tcW w:type="dxa" w:w="3528"/>
+            <w:tcW w:type="dxa" w:w="3168"/>
           </w:tcPr>
           <w:p>
             <w:pPr>
@@ -79,7 +79,7 @@
         </w:tc>
         <w:tc>
           <w:tcPr>
-            <w:tcW w:type="dxa" w:w="2088"/>
+            <w:tcW w:type="dxa" w:w="1944"/>
           </w:tcPr>
           <w:p>
             <w:pPr>
@@ -99,7 +99,7 @@
         </w:tc>
         <w:tc>
           <w:tcPr>
-            <w:tcW w:type="dxa" w:w="1368"/>
+            <w:tcW w:type="dxa" w:w="1872"/>
           </w:tcPr>
           <w:p>
             <w:pPr>
@@ -140,7 +140,7 @@
         </w:tc>
         <w:tc>
           <w:tcPr>
-            <w:tcW w:type="dxa" w:w="3528"/>
+            <w:tcW w:type="dxa" w:w="3168"/>
           </w:tcPr>
           <w:p>
             <w:pPr>
@@ -159,7 +159,7 @@
         </w:tc>
         <w:tc>
           <w:tcPr>
-            <w:tcW w:type="dxa" w:w="2088"/>
+            <w:tcW w:type="dxa" w:w="1944"/>
           </w:tcPr>
           <w:p>
             <w:pPr>
@@ -179,7 +179,7 @@
         </w:tc>
         <w:tc>
           <w:tcPr>
-            <w:tcW w:type="dxa" w:w="1368"/>
+            <w:tcW w:type="dxa" w:w="1872"/>
           </w:tcPr>
           <w:p>
             <w:pPr>
@@ -219,7 +219,7 @@
         </w:tc>
         <w:tc>
           <w:tcPr>
-            <w:tcW w:type="dxa" w:w="3528"/>
+            <w:tcW w:type="dxa" w:w="3168"/>
           </w:tcPr>
           <w:p>
             <w:pPr>
@@ -232,12 +232,15 @@
                 <w:b/>
                 <w:i w:val="0"/>
               </w:rPr>
+              <w:t>Om Dwivedi</w:t>
+              <w:br/>
+              <w:t>Om Anand Jha</w:t>
             </w:r>
           </w:p>
         </w:tc>
         <w:tc>
           <w:tcPr>
-            <w:tcW w:type="dxa" w:w="2088"/>
+            <w:tcW w:type="dxa" w:w="1944"/>
           </w:tcPr>
           <w:p>
             <w:pPr>
@@ -257,7 +260,7 @@
         </w:tc>
         <w:tc>
           <w:tcPr>
-            <w:tcW w:type="dxa" w:w="1368"/>
+            <w:tcW w:type="dxa" w:w="1872"/>
           </w:tcPr>
           <w:p>
             <w:pPr>
@@ -270,6 +273,9 @@
                 <w:b/>
                 <w:i w:val="0"/>
               </w:rPr>
+              <w:t>16010123213</w:t>
+              <w:br/>
+              <w:t>16010123214</w:t>
             </w:r>
           </w:p>
         </w:tc>

</xml_diff>